<commit_message>
Add demo link and QR code to MARISMART AR report and poster
Co-Authored-By: Claude Opus 5.5 <noreply@anthropic.com>
Claude-Session: https://claude.ai/code/session_01PeYzJs9oagP45KcKwom4qc
</commit_message>
<xml_diff>
--- a/output/MARISMART_AR_Laporan_Projek_MIPAC_TVET_2026_DIBETULKAN.docx
+++ b/output/MARISMART_AR_Laporan_Projek_MIPAC_TVET_2026_DIBETULKAN.docx
@@ -1907,14 +1907,16 @@
             <w:pPr>
               <w:spacing w:after="0"/>
             </w:pPr>
-            <w:r>
-              <w:rPr>
-                <w:color w:val="000000"/>
-                <w:sz w:val="21"/>
-                <w:highlight w:val="yellow"/>
-              </w:rPr>
-              <w:t xml:space="preserve">[ISI: pautan video/demo aktif + kod QR]</w:t>
-            </w:r>
+            <w:hyperlink r:id="rId90" w:history="1">
+              <w:r>
+                <w:rPr>
+                  <w:color w:val="0563C1"/>
+                  <w:sz w:val="21"/>
+                  <w:u w:val="single"/>
+                </w:rPr>
+                <w:t xml:space="preserve">https://sim-marismart-course.mohdasrizan.chatgpt.site/</w:t>
+              </w:r>
+            </w:hyperlink>
           </w:p>
         </w:tc>
       </w:tr>

</xml_diff>

<commit_message>
Record ChatGPT-built web prototype as AR platform in report and poster
Co-Authored-By: Claude Opus 5.5 <noreply@anthropic.com>
Claude-Session: https://claude.ai/code/session_01PeYzJs9oagP45KcKwom4qc
</commit_message>
<xml_diff>
--- a/output/MARISMART_AR_Laporan_Projek_MIPAC_TVET_2026_DIBETULKAN.docx
+++ b/output/MARISMART_AR_Laporan_Projek_MIPAC_TVET_2026_DIBETULKAN.docx
@@ -5958,10 +5958,9 @@
               <w:rPr>
                 <w:color w:val="000000"/>
                 <w:sz w:val="19"/>
-                <w:highlight w:val="yellow"/>
                 <w:lang w:val="sv-SE"/>
               </w:rPr>
-              <w:t xml:space="preserve">[ISI: contoh Unity + Vuforia / Adobe Aero / Zappar / Metaverse Studio]</w:t>
+              <w:t xml:space="preserve">Aplikasi web interaktif dibina menggunakan ChatGPT (GPT-5) dan dihoskan di chatgpt.site; diakses melalui pelayar web pada telefon pintar/tablet tanpa pemasangan aplikasi.</w:t>
             </w:r>
           </w:p>
         </w:tc>
@@ -5989,7 +5988,7 @@
                 <w:sz w:val="19"/>
                 <w:lang w:val="sv-SE"/>
               </w:rPr>
-              <w:t xml:space="preserve">Versi dan lesen direkod dalam log pembangunan.</w:t>
+              <w:t xml:space="preserve">Pautan demo: sim-marismart-course.mohdasrizan.chatgpt.site; versi direkod dalam Lampiran C.</w:t>
             </w:r>
           </w:p>
         </w:tc>
@@ -7363,7 +7362,7 @@
                 <w:sz w:val="20"/>
                 <w:lang w:val="sv-SE"/>
               </w:rPr>
-              <w:t>Menjana/menyusun penerangan, menjawab soalan dalam skop modul, memberi soalan pengukuhan dan membantu semakan kandungan.</w:t>
+              <w:t>Membina prototaip aplikasi web MARISMART AR, menjana/menyusun penerangan, menjawab soalan dalam skop modul, memberi soalan pengukuhan dan membantu semakan kandungan.</w:t>
             </w:r>
           </w:p>
         </w:tc>
@@ -14664,6 +14663,161 @@
                 <w:sz w:val="17"/>
               </w:rPr>
               <w:t xml:space="preserve">Jawapan telah disemak dan arahan pengesahan manual telah ditambah.</w:t>
+            </w:r>
+          </w:p>
+        </w:tc>
+        <w:tc>
+          <w:tcPr>
+            <w:tcW w:w="1008" w:type="dxa"/>
+            <w:tcMar>
+              <w:top w:w="70" w:type="dxa"/>
+              <w:left w:w="90" w:type="dxa"/>
+              <w:bottom w:w="70" w:type="dxa"/>
+              <w:right w:w="90" w:type="dxa"/>
+            </w:tcMar>
+            <w:vAlign w:val="center"/>
+          </w:tcPr>
+          <w:p>
+            <w:pPr>
+              <w:spacing w:after="0"/>
+            </w:pPr>
+            <w:r>
+              <w:rPr>
+                <w:strike/>
+                <w:color w:val="000000"/>
+                <w:sz w:val="17"/>
+              </w:rPr>
+              <w:t xml:space="preserve">Diubah &amp; Lulus</w:t>
+            </w:r>
+          </w:p>
+        </w:tc>
+      </w:tr>
+      <w:tr>
+        <w:trPr>
+          <w:jc w:val="center"/>
+        </w:trPr>
+        <w:tc>
+          <w:tcPr>
+            <w:tcW w:w="1224" w:type="dxa"/>
+            <w:tcMar>
+              <w:top w:w="70" w:type="dxa"/>
+              <w:left w:w="90" w:type="dxa"/>
+              <w:bottom w:w="70" w:type="dxa"/>
+              <w:right w:w="90" w:type="dxa"/>
+            </w:tcMar>
+            <w:vAlign w:val="center"/>
+          </w:tcPr>
+          <w:p>
+            <w:pPr>
+              <w:spacing w:after="0"/>
+            </w:pPr>
+            <w:r>
+              <w:rPr>
+                <w:color w:val="000000"/>
+                <w:sz w:val="17"/>
+                <w:highlight w:val="yellow"/>
+              </w:rPr>
+              <w:t xml:space="preserve">[ISI tarikh]</w:t>
+            </w:r>
+          </w:p>
+        </w:tc>
+        <w:tc>
+          <w:tcPr>
+            <w:tcW w:w="1584" w:type="dxa"/>
+            <w:tcMar>
+              <w:top w:w="70" w:type="dxa"/>
+              <w:left w:w="90" w:type="dxa"/>
+              <w:bottom w:w="70" w:type="dxa"/>
+              <w:right w:w="90" w:type="dxa"/>
+            </w:tcMar>
+            <w:vAlign w:val="center"/>
+          </w:tcPr>
+          <w:p>
+            <w:pPr>
+              <w:spacing w:after="0"/>
+            </w:pPr>
+            <w:r>
+              <w:rPr>
+                <w:color w:val="000000"/>
+                <w:sz w:val="17"/>
+              </w:rPr>
+              <w:t xml:space="preserve">ChatGPT / GPT-5</w:t>
+            </w:r>
+          </w:p>
+        </w:tc>
+        <w:tc>
+          <w:tcPr>
+            <w:tcW w:w="2448" w:type="dxa"/>
+            <w:tcMar>
+              <w:top w:w="70" w:type="dxa"/>
+              <w:left w:w="90" w:type="dxa"/>
+              <w:bottom w:w="70" w:type="dxa"/>
+              <w:right w:w="90" w:type="dxa"/>
+            </w:tcMar>
+            <w:vAlign w:val="center"/>
+          </w:tcPr>
+          <w:p>
+            <w:pPr>
+              <w:spacing w:after="0"/>
+              <w:rPr>
+                <w:lang w:val="fi-FI"/>
+              </w:rPr>
+            </w:pPr>
+            <w:r>
+              <w:rPr>
+                <w:color w:val="000000"/>
+                <w:sz w:val="17"/>
+                <w:lang w:val="fi-FI"/>
+              </w:rPr>
+              <w:t xml:space="preserve">Membina prototaip aplikasi web MARISMART AR (antara muka, panduan langkah, checklist).</w:t>
+            </w:r>
+          </w:p>
+        </w:tc>
+        <w:tc>
+          <w:tcPr>
+            <w:tcW w:w="1584" w:type="dxa"/>
+            <w:tcMar>
+              <w:top w:w="70" w:type="dxa"/>
+              <w:left w:w="90" w:type="dxa"/>
+              <w:bottom w:w="70" w:type="dxa"/>
+              <w:right w:w="90" w:type="dxa"/>
+            </w:tcMar>
+            <w:vAlign w:val="center"/>
+          </w:tcPr>
+          <w:p>
+            <w:pPr>
+              <w:spacing w:after="0"/>
+            </w:pPr>
+            <w:r>
+              <w:rPr>
+                <w:color w:val="000000"/>
+                <w:sz w:val="17"/>
+              </w:rPr>
+              <w:t xml:space="preserve">NOSS, SOP dan storyboard projek.</w:t>
+            </w:r>
+          </w:p>
+        </w:tc>
+        <w:tc>
+          <w:tcPr>
+            <w:tcW w:w="2088" w:type="dxa"/>
+            <w:tcMar>
+              <w:top w:w="70" w:type="dxa"/>
+              <w:left w:w="90" w:type="dxa"/>
+              <w:bottom w:w="70" w:type="dxa"/>
+              <w:right w:w="90" w:type="dxa"/>
+            </w:tcMar>
+            <w:vAlign w:val="center"/>
+          </w:tcPr>
+          <w:p>
+            <w:pPr>
+              <w:spacing w:after="0"/>
+            </w:pPr>
+            <w:r>
+              <w:rPr>
+                <w:color w:val="000000"/>
+                <w:sz w:val="17"/>
+              </w:rPr>
+              <w:t xml:space="preserve">Fungsi, istilah dan kandungan keselamatan diuji dan disemak oleh pengajar.</w:t>
             </w:r>
           </w:p>
         </w:tc>

</xml_diff>

<commit_message>
Describe MARISMART prototype as on-screen web simulation; camera AR planned for phase 2
Co-Authored-By: Claude Opus 5.5 <noreply@anthropic.com>
Claude-Session: https://claude.ai/code/session_01PeYzJs9oagP45KcKwom4qc
</commit_message>
<xml_diff>
--- a/output/MARISMART_AR_Laporan_Projek_MIPAC_TVET_2026_DIBETULKAN.docx
+++ b/output/MARISMART_AR_Laporan_Projek_MIPAC_TVET_2026_DIBETULKAN.docx
@@ -1857,7 +1857,7 @@
               </w:rPr>
               <w:t xml:space="preserve">Tc. Mohd Asrizan bin Deraman (Ketua): penyelarasan projek, reka bentuk pengalaman pembelajaran, pemetaan kandungan NOSS, semakan kandungan dan pengesahan akhir.</w:t>
               <w:br/>
-              <w:t xml:space="preserve">Roslan bin Sulaiman (Ahli): pembangunan AR, AI dan dokumentasi teknikal.</w:t>
+              <w:t xml:space="preserve">Roslan bin Sulaiman (Ahli): pembangunan simulasi web, AI dan dokumentasi teknikal.</w:t>
               <w:br/>
               <w:t xml:space="preserve">Kedua-dua ahli: pengujian, analisis bukti dan penyediaan bahan demonstrasi.</w:t>
             </w:r>
@@ -1956,7 +1956,7 @@
           <w:color w:val="000000"/>
           <w:sz w:val="22"/>
         </w:rPr>
-        <w:t xml:space="preserve">MARISMART AR ialah alat bantu pengajaran digital imersif yang dibangunkan untuk menyokong penguasaan kompetensi pemeriksaan jentera bantuan marin melalui gabungan Augmented Reality (AR), Artificial Intelligence (AI), panduan langkah demi langkah dan senarai semak digital. Keperluan inovasi ini berpunca daripada sifat tugasan pemeriksaan yang memerlukan pelajar mengenal pasti komponen, membaca parameter operasi, mengesan keabnormalan dan merekod status peralatan selaras dengan manual, Standard Operating Procedure (SOP) serta keperluan kompetensi Marine Auxiliary Machinery Servicing. Inovasi ini direka bentuk sebagai lapisan pembelajaran kontekstual: objek atau penanda peralatan dipilih melalui peranti mudah alih, arahan pemeriksaan dipaparkan secara spatial, dan pembantu AI menjawab soalan berasaskan korpus rujukan yang disahkan. Pembangunan dilaksanakan melalui analisis keperluan, pemetaan hasil pembelajaran, reka bentuk seni bina sistem, pembangunan prototaip, semakan pakar, ujian kebolehgunaan dan penilaian pembelajaran. Sumbangan utama MARISMART AR ialah penyepaduan visual AR, sokongan AI dan rekod bukti pemeriksaan dalam satu aliran kerja yang boleh diulang. </w:t>
+        <w:t xml:space="preserve">MARISMART AR ialah alat bantu pengajaran digital interaktif yang dibangunkan untuk menyokong penguasaan kompetensi pemeriksaan jentera bantuan marin melalui simulasi interaktif berasaskan web yang meniru paparan Augmented Reality (AR), Artificial Intelligence (AI), panduan langkah demi langkah dan senarai semak digital. Keperluan inovasi ini berpunca daripada sifat tugasan pemeriksaan yang memerlukan pelajar mengenal pasti komponen, membaca parameter operasi, mengesan keabnormalan dan merekod status peralatan selaras dengan manual, Standard Operating Procedure (SOP) serta keperluan kompetensi Marine Auxiliary Machinery Servicing. Dalam prototaip Fasa 1, pelajar memilih peralatan pada skrin telefon, tablet atau komputer; label, titik pemeriksaan dan arahan dipaparkan pada imej atau model peralatan, dan pembantu AI menjawab soalan berasaskan korpus rujukan yang disahkan. Pembangunan dilaksanakan melalui analisis keperluan, pemetaan hasil pembelajaran, reka bentuk seni bina sistem, pembangunan prototaip, semakan pakar, ujian kebolehgunaan dan penilaian pembelajaran. Sumbangan utama MARISMART AR ialah penyepaduan visual interaktif, sokongan AI dan rekod bukti pemeriksaan dalam satu aliran kerja yang boleh diulang. AR berasaskan kamera pada peralatan sebenar dirancang untuk Fasa 2. </w:t>
       </w:r>
       <w:r>
         <w:rPr>
@@ -2198,7 +2198,7 @@
           <w:color w:val="000000"/>
           <w:lang w:val="sv-SE"/>
         </w:rPr>
-        <w:t>MARISMART AR dibangunkan sebagai alat bantu pengajaran yang merapatkan jurang antara penerangan teori dan tindakan pemeriksaan dalam persekitaran bengkel atau simulasi. AR digunakan untuk memautkan maklumat digital kepada objek atau lokasi peralatan, manakala AI digunakan secara terkawal untuk memberi penjelasan, soalan pengukuhan dan maklum balas berasaskan sumber yang diluluskan. Pendekatan ini menyokong pembelajaran berasaskan kompetensi, constructive alignment dan pembuktian prestasi melalui checklist serta log aktiviti.</w:t>
+        <w:t>MARISMART AR dibangunkan sebagai alat bantu pengajaran yang merapatkan jurang antara penerangan teori dan tindakan pemeriksaan dalam persekitaran bengkel atau simulasi. Simulasi pada skrin memautkan maklumat digital kepada komponen pada imej atau model peralatan (Fasa 1), dan akan dilanjutkan kepada AR berasaskan kamera pada peralatan sebenar (Fasa 2), manakala AI digunakan secara terkawal untuk memberi penjelasan, soalan pengukuhan dan maklum balas berasaskan sumber yang diluluskan. Pendekatan ini menyokong pembelajaran berasaskan kompetensi, constructive alignment dan pembuktian prestasi melalui checklist serta log aktiviti.</w:t>
       </w:r>
     </w:p>
     <w:p>
@@ -2241,7 +2241,7 @@
           <w:color w:val="000000"/>
           <w:lang w:val="sv-SE"/>
         </w:rPr>
-        <w:t>1. Mereka bentuk alat bantu pengajaran digital yang memvisualkan prosedur pemeriksaan jentera bantuan marin melalui AR.</w:t>
+        <w:t>1. Mereka bentuk alat bantu pengajaran digital yang memvisualkan prosedur pemeriksaan jentera bantuan marin melalui simulasi interaktif pada skrin, sebagai asas kepada AR berasaskan kamera.</w:t>
       </w:r>
     </w:p>
     <w:p>
@@ -2334,7 +2334,7 @@
           <w:color w:val="000000"/>
           <w:lang w:val="sv-SE"/>
         </w:rPr>
-        <w:t>Skop prototaip memberi tumpuan kepada pemeriksaan jentera bantuan marin yang boleh diwakili melalui model, imej atau penanda peralatan. Modul awal meliputi pengenalpastian komponen, persediaan PPE dan dokumen kerja, pemeriksaan suhu, aras minyak, aras air, tekanan, alarm, keadaan fizikal, pemerhatian prestasi serta pengemaskinian checklist. Skop ini tidak menggantikan manual pengilang, SOP institusi, Job Safety Analysis (JSA), Permit To Work (PTW), arahan pegawai berkuasa atau latihan praktikal bersemuka.</w:t>
+        <w:t>Skop prototaip memberi tumpuan kepada pemeriksaan jentera bantuan marin yang diwakili melalui imej dan model peralatan dalam simulasi web pada skrin. AR berasaskan kamera tidak termasuk dalam skop prototaip Fasa 1. Modul awal meliputi pengenalpastian komponen, persediaan PPE dan dokumen kerja, pemeriksaan suhu, aras minyak, aras air, tekanan, alarm, keadaan fizikal, pemerhatian prestasi serta pengemaskinian checklist. Skop ini tidak menggantikan manual pengilang, SOP institusi, Job Safety Analysis (JSA), Permit To Work (PTW), arahan pegawai berkuasa atau latihan praktikal bersemuka.</w:t>
       </w:r>
     </w:p>
     <w:p>
@@ -2549,7 +2549,7 @@
                 <w:color w:val="000000"/>
                 <w:sz w:val="21"/>
               </w:rPr>
-              <w:t>Visual spatial, panduan langkah dan checklist berulang.</w:t>
+              <w:t>Visual interaktif, panduan langkah dan checklist berulang.</w:t>
             </w:r>
           </w:p>
         </w:tc>
@@ -2851,7 +2851,7 @@
           <w:color w:val="000000"/>
           <w:lang w:val="sv-SE"/>
         </w:rPr>
-        <w:t xml:space="preserve">Inovasi ini disertakan dalam kategori inovasi pedagogi dan AI untuk Creative TVET, dengan fokus kepada alat bantu pengajaran digital imersif bagi kompetensi maritim. Laporan ini disediakan mengikut format dan kandungan yang ditetapkan oleh penganjur [1].</w:t>
+        <w:t xml:space="preserve">Inovasi ini disertakan dalam kategori inovasi pedagogi dan AI untuk Creative TVET, dengan fokus kepada alat bantu pengajaran digital interaktif bagi kompetensi maritim. Laporan ini disediakan mengikut format dan kandungan yang ditetapkan oleh penganjur [1].</w:t>
       </w:r>
     </w:p>
     <w:p>
@@ -3465,7 +3465,7 @@
           <w:color w:val="000000"/>
           <w:lang w:val="sv-SE"/>
         </w:rPr>
-        <w:t>Menggabungkan AR dan AI dalam satu aliran pembelajaran yang berorientasikan kompetensi pemeriksaan, bukan sekadar paparan model 3D. Kajian lepas menunjukkan AR meningkatkan kefahaman spatial dan motivasi pelajar, namun memerlukan reka bentuk pedagogi yang jelas [4].</w:t>
+        <w:t>Menggabungkan visual interaktif gaya AR dan AI dalam satu aliran pembelajaran yang berorientasikan kompetensi pemeriksaan, bukan sekadar paparan model 3D. Kajian lepas menunjukkan AR meningkatkan kefahaman spatial dan motivasi pelajar, namun memerlukan reka bentuk pedagogi yang jelas [4].</w:t>
       </w:r>
     </w:p>
     <w:p>
@@ -3481,7 +3481,7 @@
           <w:color w:val="000000"/>
           <w:lang w:val="sv-SE"/>
         </w:rPr>
-        <w:t>Menghubungkan setiap langkah AR kepada hasil pembelajaran, kriteria prestasi, risiko keselamatan, checklist dan bukti pemerhatian.</w:t>
+        <w:t>Menghubungkan setiap langkah simulasi kepada hasil pembelajaran, kriteria prestasi, risiko keselamatan, checklist dan bukti pemerhatian.</w:t>
       </w:r>
     </w:p>
     <w:p>
@@ -4111,7 +4111,7 @@
                 <w:sz w:val="19"/>
                 <w:lang w:val="fi-FI"/>
               </w:rPr>
-              <w:t>Lapisan AR dan navigasi mengikut langkah serta keadaan peralatan.</w:t>
+              <w:t>Paparan interaktif dan navigasi mengikut langkah serta keadaan peralatan.</w:t>
             </w:r>
           </w:p>
         </w:tc>
@@ -4356,7 +4356,7 @@
           <w:color w:val="000000"/>
           <w:lang w:val="sv-SE"/>
         </w:rPr>
-        <w:t>Jurang utama yang masih perlu diselesaikan ialah pembuktian keberkesanan. Kehadiran AR dan AI sahaja tidak membuktikan peningkatan kompetensi. Oleh itu, MARISMART AR menggunakan reka bentuk penilaian yang membezakan indikator pembelajaran, kebolehgunaan, keselamatan, penerimaan dan impak operasi.</w:t>
+        <w:t>Jurang utama yang masih perlu diselesaikan ialah pembuktian keberkesanan. Kehadiran visual interaktif dan AI sahaja tidak membuktikan peningkatan kompetensi. Oleh itu, MARISMART AR menggunakan reka bentuk penilaian yang membezakan indikator pembelajaran, kebolehgunaan, keselamatan, penerimaan dan impak operasi.</w:t>
       </w:r>
     </w:p>
     <w:p>
@@ -4409,7 +4409,7 @@
           <w:color w:val="000000"/>
           <w:lang w:val="fi-FI"/>
         </w:rPr>
-        <w:t xml:space="preserve">Pembangunan MARISMART AR menggunakan kitaran analisis, reka bentuk, pembangunan, uji cuba dan penambahbaikan. Setiap kitaran menghasilkan artefak yang boleh disemak: peta kompetensi, skrip pembelajaran, model atau penanda AR, prompt AI, rubrik, log uji cuba dan keputusan penambahbaikan. Pemetaan kompetensi kepada aktiviti pembelajaran ditunjukkan dalam Jadual 4.</w:t>
+        <w:t xml:space="preserve">Pembangunan MARISMART AR menggunakan kitaran analisis, reka bentuk, pembangunan, uji cuba dan penambahbaikan. Setiap kitaran menghasilkan artefak yang boleh disemak: peta kompetensi, skrip pembelajaran, skrin simulasi dan aset visual, prompt AI, rubrik, log uji cuba dan keputusan penambahbaikan. Pemetaan kompetensi kepada aktiviti pembelajaran ditunjukkan dalam Jadual 4.</w:t>
       </w:r>
     </w:p>
     <w:p>
@@ -4662,7 +4662,7 @@
                 <w:sz w:val="21"/>
                 <w:lang w:val="sv-SE"/>
               </w:rPr>
-              <w:t>Ikut penanda AR untuk suhu, minyak, air, tekanan dan alarm.</w:t>
+              <w:t>Ikut titik pemeriksaan pada skrin untuk suhu, minyak, air, tekanan dan alarm.</w:t>
             </w:r>
           </w:p>
         </w:tc>
@@ -4901,7 +4901,7 @@
           <w:color w:val="000000"/>
           <w:lang w:val="sv-SE"/>
         </w:rPr>
-        <w:t>Seni bina konsep MARISMART AR terdiri daripada empat lapisan. Lapisan pengalaman AR memaparkan objek, label, anak panah, parameter dan amaran keselamatan. Lapisan pedagogi menyusun objektif, arahan, soalan dan checklist. Lapisan AI mengurus pertanyaan, penjelasan dan maklum balas berasaskan sumber. Lapisan data dan tadbir urus mengawal korpus rujukan, log penggunaan, privasi dan versi kandungan. Fungsi setiap lapisan diringkaskan dalam Jadual 5.</w:t>
+        <w:t>Seni bina konsep MARISMART AR terdiri daripada empat lapisan. Lapisan paparan interaktif (Fasa 1: simulasi pada skrin; Fasa 2: AR berasaskan kamera) memaparkan objek, label, anak panah, parameter dan amaran keselamatan. Lapisan pedagogi menyusun objektif, arahan, soalan dan checklist. Lapisan AI mengurus pertanyaan, penjelasan dan maklum balas berasaskan sumber. Lapisan data dan tadbir urus mengawal korpus rujukan, log penggunaan, privasi dan versi kandungan. Fungsi setiap lapisan diringkaskan dalam Jadual 5.</w:t>
       </w:r>
     </w:p>
     <w:p>
@@ -5122,7 +5122,7 @@
                 <w:color w:val="000000"/>
                 <w:sz w:val="20"/>
               </w:rPr>
-              <w:t>Pengalaman AR</w:t>
+              <w:t>Paparan interaktif</w:t>
             </w:r>
           </w:p>
         </w:tc>
@@ -5146,7 +5146,7 @@
                 <w:color w:val="000000"/>
                 <w:sz w:val="20"/>
               </w:rPr>
-              <w:t>Penanda/marker, model 3D atau imej, overlay, audio/teks</w:t>
+              <w:t>Imej/model peralatan, label, hotspot dan teks pada skrin (Fasa 1); penanda dan overlay kamera (Fasa 2)</w:t>
             </w:r>
           </w:p>
         </w:tc>
@@ -5618,7 +5618,7 @@
                 <w:sz w:val="19"/>
                 <w:lang w:val="sv-SE"/>
               </w:rPr>
-              <w:t>Telefon pintar/tablet berkamera atau komputer dengan kamera, mengikut keperluan prototaip.</w:t>
+              <w:t>Telefon pintar, tablet atau komputer dengan pelayar web; kamera tidak diperlukan dalam Fasa 1.</w:t>
             </w:r>
           </w:p>
         </w:tc>
@@ -5676,7 +5676,7 @@
                 <w:color w:val="000000"/>
                 <w:sz w:val="19"/>
               </w:rPr>
-              <w:t xml:space="preserve">Kandungan AR</w:t>
+              <w:t xml:space="preserve">Kandungan visual</w:t>
             </w:r>
           </w:p>
         </w:tc>
@@ -5932,7 +5932,7 @@
                 <w:color w:val="000000"/>
                 <w:sz w:val="19"/>
               </w:rPr>
-              <w:t xml:space="preserve">Perisian AR</w:t>
+              <w:t xml:space="preserve">Platform simulasi</w:t>
             </w:r>
           </w:p>
         </w:tc>
@@ -6134,7 +6134,7 @@
           <w:color w:val="000000"/>
           <w:lang w:val="sv-SE"/>
         </w:rPr>
-        <w:t>2. Pelajar mengimbas penanda atau memilih model peralatan; sistem memaparkan komponen dan urutan pemeriksaan.</w:t>
+        <w:t>2. Pelajar memilih peralatan pada skrin; sistem memaparkan komponen, label dan urutan pemeriksaan.</w:t>
       </w:r>
     </w:p>
     <w:p>
@@ -7843,7 +7843,7 @@
           <w:color w:val="000000"/>
           <w:lang w:val="sv-SE"/>
         </w:rPr>
-        <w:t>Antara muka diuji pada telefon pintar dan tablet yang menjadi peranti sasaran; keperluan kamera, cahaya dan penanda direkodkan.</w:t>
+        <w:t>Antara muka diuji pada telefon pintar dan tablet yang menjadi peranti sasaran; keperluan pelayar, saiz skrin dan sambungan internet direkodkan.</w:t>
       </w:r>
     </w:p>
     <w:p>
@@ -7859,7 +7859,7 @@
           <w:color w:val="000000"/>
           <w:lang w:val="sv-SE"/>
         </w:rPr>
-        <w:t>Alternatif 2D atau mod desktop disediakan jika AR tidak dapat digunakan.</w:t>
+        <w:t>Simulasi boleh dibuka pada pelayar telefon, tablet atau desktop tanpa pemasangan aplikasi.</w:t>
       </w:r>
     </w:p>
     <w:p>
@@ -9897,7 +9897,7 @@
                 <w:color w:val="000000"/>
                 <w:sz w:val="21"/>
               </w:rPr>
-              <w:t>Beberapa modul auxiliary machinery dan kelas lebih besar.</w:t>
+              <w:t>Beberapa modul auxiliary machinery, kelas lebih besar dan AR berasaskan kamera.</w:t>
             </w:r>
           </w:p>
         </w:tc>
@@ -10193,7 +10193,7 @@
           <w:color w:val="000000"/>
           <w:lang w:val="sv-SE"/>
         </w:rPr>
-        <w:t>Mengekalkan mod alternatif tanpa AR supaya PdP tidak terhenti apabila peranti, rangkaian atau penanda gagal.</w:t>
+        <w:t>Mengekalkan mod simulasi pada skrin sebagai sandaran apabila AR berasaskan kamera diperkenalkan dalam Fasa 2.</w:t>
       </w:r>
     </w:p>
     <w:p>
@@ -10386,7 +10386,7 @@
                 <w:color w:val="000000"/>
                 <w:sz w:val="21"/>
               </w:rPr>
-              <w:t xml:space="preserve">Perisian/lesen AR</w:t>
+              <w:t xml:space="preserve">Perisian/lesen AR (Fasa 2)</w:t>
             </w:r>
           </w:p>
         </w:tc>
@@ -10726,7 +10726,7 @@
                 <w:color w:val="000000"/>
                 <w:sz w:val="21"/>
               </w:rPr>
-              <w:t xml:space="preserve">Cetakan penanda AR/QR dan bahan</w:t>
+              <w:t xml:space="preserve">Cetakan kod QR dan bahan</w:t>
             </w:r>
           </w:p>
         </w:tc>
@@ -10915,7 +10915,7 @@
           <w:color w:val="000000"/>
           <w:lang w:val="sv-SE"/>
         </w:rPr>
-        <w:t>MARISMART AR dibangunkan sebagai alat bantu pengajaran yang menggabungkan visual AR, sokongan AI dan rekod checklist untuk membantu pelajar memahami pemeriksaan jentera bantuan marin secara lebih kontekstual. Reka bentuknya berpaksikan kompetensi yang dinyatakan dalam NOSS, khususnya perancangan kerja, pemeriksaan parameter, pengesanan keabnormalan, penyenggaraan dan pengemaskinian laporan [2][3].</w:t>
+        <w:t>MARISMART AR dibangunkan sebagai alat bantu pengajaran yang menggabungkan simulasi visual interaktif, sokongan AI dan rekod checklist untuk membantu pelajar memahami pemeriksaan jentera bantuan marin secara lebih kontekstual. Reka bentuknya berpaksikan kompetensi yang dinyatakan dalam NOSS, khususnya perancangan kerja, pemeriksaan parameter, pengesanan keabnormalan, penyenggaraan dan pengemaskinian laporan [2][3].</w:t>
       </w:r>
     </w:p>
     <w:p>
@@ -10932,7 +10932,7 @@
           <w:color w:val="000000"/>
           <w:lang w:val="sv-SE"/>
         </w:rPr>
-        <w:t xml:space="preserve">Kekuatan utama inovasi ialah penyepaduan pedagogi dan teknologi: AR menjawab persoalan ‘di mana dan bagaimana’, AI membantu persoalan ‘mengapa’, manakala checklist dan rubrik menjawab persoalan ‘bagaimana prestasi dibuktikan’. Uji rintis menunjukkan peningkatan skor pengetahuan/prosedur daripada </w:t>
+        <w:t xml:space="preserve">Kekuatan utama inovasi ialah penyepaduan pedagogi dan teknologi: simulasi visual menjawab persoalan ‘di mana dan bagaimana’, AI membantu persoalan ‘mengapa’, manakala checklist dan rubrik menjawab persoalan ‘bagaimana prestasi dibuktikan’. Uji rintis menunjukkan peningkatan skor pengetahuan/prosedur daripada </w:t>
       </w:r>
       <w:r>
         <w:rPr>
@@ -10962,7 +10962,7 @@
           <w:color w:val="000000"/>
           <w:lang w:val="sv-SE"/>
         </w:rPr>
-        <w:t xml:space="preserve">. Pembangunan seterusnya memfokuskan pengesahan korpus, keselamatan, aksesibiliti, uji cuba dengan sampel lebih besar serta peluasan modul kepada pam, pemampat dan purifier.</w:t>
+        <w:t xml:space="preserve">. Pembangunan seterusnya memfokuskan pengesahan korpus, keselamatan, aksesibiliti, uji cuba dengan sampel lebih besar serta peluasan modul kepada pam, pemampat dan purifier, serta pembangunan AR berasaskan kamera pada peralatan sebenar (Fasa 2).</w:t>
       </w:r>
     </w:p>
     <w:p>
@@ -12488,7 +12488,7 @@
                 <w:sz w:val="18"/>
                 <w:lang w:val="sv-SE"/>
               </w:rPr>
-              <w:t>Pembangunan AR dan korpus AI</w:t>
+              <w:t>Pembangunan simulasi web dan korpus AI</w:t>
             </w:r>
           </w:p>
         </w:tc>
@@ -13399,7 +13399,7 @@
                 <w:sz w:val="19"/>
                 <w:lang w:val="sv-SE"/>
               </w:rPr>
-              <w:t>Label AR sepadan dengan komponen yang ditunjukkan.</w:t>
+              <w:t>Label pada skrin sepadan dengan komponen yang ditunjukkan.</w:t>
             </w:r>
           </w:p>
         </w:tc>
@@ -13459,7 +13459,7 @@
                 <w:sz w:val="19"/>
                 <w:lang w:val="sv-SE"/>
               </w:rPr>
-              <w:t>Label AR jelas dan sepadan dengan komponen yang ditunjukkan</w:t>
+              <w:t>Label pada skrin jelas dan sepadan dengan komponen yang ditunjukkan</w:t>
             </w:r>
           </w:p>
         </w:tc>

</xml_diff>

<commit_message>
Fill pilot trial data (13 students, 2 instructors, 30/09/2026) and rename Immersive to Interactive
Co-Authored-By: Claude Opus 5.5 <noreply@anthropic.com>
Claude-Session: https://claude.ai/code/session_01PeYzJs9oagP45KcKwom4qc
</commit_message>
<xml_diff>
--- a/output/MARISMART_AR_Laporan_Projek_MIPAC_TVET_2026_DIBETULKAN.docx
+++ b/output/MARISMART_AR_Laporan_Projek_MIPAC_TVET_2026_DIBETULKAN.docx
@@ -42,7 +42,7 @@
           <w:color w:val="000000"/>
           <w:sz w:val="28"/>
         </w:rPr>
-        <w:t>AI-POWERED IMMERSIVE DIGITAL TEACHING AID FOR</w:t>
+        <w:t>AI-POWERED INTERACTIVE DIGITAL TEACHING AID FOR</w:t>
       </w:r>
     </w:p>
     <w:p>
@@ -1971,9 +1971,8 @@
           <w:i/>
           <w:color w:val="000000"/>
           <w:sz w:val="22"/>
-          <w:highlight w:val="yellow"/>
-        </w:rPr>
-        <w:t xml:space="preserve">[n]</w:t>
+        </w:rPr>
+        <w:t xml:space="preserve">13</w:t>
       </w:r>
       <w:r>
         <w:rPr>
@@ -1988,9 +1987,8 @@
           <w:i/>
           <w:color w:val="000000"/>
           <w:sz w:val="22"/>
-          <w:highlight w:val="yellow"/>
-        </w:rPr>
-        <w:t xml:space="preserve">[n]</w:t>
+        </w:rPr>
+        <w:t xml:space="preserve">2</w:t>
       </w:r>
       <w:r>
         <w:rPr>
@@ -2005,9 +2003,8 @@
           <w:i/>
           <w:color w:val="000000"/>
           <w:sz w:val="22"/>
-          <w:highlight w:val="yellow"/>
-        </w:rPr>
-        <w:t xml:space="preserve">[tarikh]</w:t>
+        </w:rPr>
+        <w:t xml:space="preserve">30/09/2026</w:t>
       </w:r>
       <w:r>
         <w:rPr>
@@ -2022,7 +2019,6 @@
           <w:i/>
           <w:color w:val="000000"/>
           <w:sz w:val="22"/>
-          <w:highlight w:val="yellow"/>
         </w:rPr>
         <w:t xml:space="preserve">56 kepada 84/100</w:t>
       </w:r>
@@ -2039,7 +2035,6 @@
           <w:i/>
           <w:color w:val="000000"/>
           <w:sz w:val="22"/>
-          <w:highlight w:val="yellow"/>
         </w:rPr>
         <w:t xml:space="preserve">60% kepada 88%</w:t>
       </w:r>
@@ -2056,7 +2051,6 @@
           <w:i/>
           <w:color w:val="000000"/>
           <w:sz w:val="22"/>
-          <w:highlight w:val="yellow"/>
         </w:rPr>
         <w:t xml:space="preserve">20 kepada 12 minit</w:t>
       </w:r>
@@ -2073,7 +2067,6 @@
           <w:i/>
           <w:color w:val="000000"/>
           <w:sz w:val="22"/>
-          <w:highlight w:val="yellow"/>
         </w:rPr>
         <w:t xml:space="preserve">4.5/5</w:t>
       </w:r>
@@ -2933,7 +2926,6 @@
       <w:r>
         <w:rPr>
           <w:color w:val="000000"/>
-          <w:highlight w:val="yellow"/>
           <w:lang w:val="sv-SE"/>
         </w:rPr>
         <w:t xml:space="preserve">56/100</w:t>
@@ -2948,7 +2940,6 @@
       <w:r>
         <w:rPr>
           <w:color w:val="000000"/>
-          <w:highlight w:val="yellow"/>
           <w:lang w:val="sv-SE"/>
         </w:rPr>
         <w:t xml:space="preserve">60%</w:t>
@@ -2963,7 +2954,6 @@
       <w:r>
         <w:rPr>
           <w:color w:val="000000"/>
-          <w:highlight w:val="yellow"/>
           <w:lang w:val="sv-SE"/>
         </w:rPr>
         <w:t xml:space="preserve">55%</w:t>
@@ -7063,10 +7053,9 @@
       <w:r>
         <w:rPr>
           <w:color w:val="000000"/>
-          <w:highlight w:val="yellow"/>
           <w:lang w:val="sv-SE"/>
         </w:rPr>
-        <w:t xml:space="preserve">[n]</w:t>
+        <w:t xml:space="preserve">13</w:t>
       </w:r>
       <w:r>
         <w:rPr>
@@ -7078,10 +7067,9 @@
       <w:r>
         <w:rPr>
           <w:color w:val="000000"/>
-          <w:highlight w:val="yellow"/>
           <w:lang w:val="sv-SE"/>
         </w:rPr>
-        <w:t xml:space="preserve">[n]</w:t>
+        <w:t xml:space="preserve">2</w:t>
       </w:r>
       <w:r>
         <w:rPr>
@@ -7093,10 +7081,9 @@
       <w:r>
         <w:rPr>
           <w:color w:val="000000"/>
-          <w:highlight w:val="yellow"/>
           <w:lang w:val="sv-SE"/>
         </w:rPr>
-        <w:t xml:space="preserve">[lokasi, contoh bengkel/simulator ALAM]</w:t>
+        <w:t xml:space="preserve">Akademi Laut Malaysia (ALAM) menggunakan SIM MARISMART</w:t>
       </w:r>
       <w:r>
         <w:rPr>
@@ -7108,17 +7095,16 @@
       <w:r>
         <w:rPr>
           <w:color w:val="000000"/>
-          <w:highlight w:val="yellow"/>
           <w:lang w:val="sv-SE"/>
         </w:rPr>
-        <w:t xml:space="preserve">[tarikh]</w:t>
+        <w:t xml:space="preserve">30/09/2026</w:t>
       </w:r>
       <w:r>
         <w:rPr>
           <w:color w:val="000000"/>
           <w:lang w:val="sv-SE"/>
         </w:rPr>
-        <w:t xml:space="preserve">. Keputusan dilaporkan dalam Jadual 10 dan Lampiran B.</w:t>
+        <w:t xml:space="preserve">. Data direkod oleh sistem SIM MARISMART dan keputusan dilaporkan dalam Jadual 10 dan Lampiran B.</w:t>
       </w:r>
     </w:p>
     <w:p>
@@ -8489,37 +8475,7 @@
           <w:color w:val="000000"/>
           <w:lang w:val="sv-SE"/>
         </w:rPr>
-        <w:t xml:space="preserve">Impak MARISMART AR dilaporkan pada tiga aras: hasil pembelajaran, pengalaman pengguna dan kecekapan pelaksanaan. Jadual 10 membandingkan data sebelum dan selepas penggunaan MARISMART AR dalam uji rintis bersama </w:t>
-      </w:r>
-      <w:r>
-        <w:rPr>
-          <w:color w:val="000000"/>
-          <w:highlight w:val="yellow"/>
-          <w:lang w:val="sv-SE"/>
-        </w:rPr>
-        <w:t xml:space="preserve">[n]</w:t>
-      </w:r>
-      <w:r>
-        <w:rPr>
-          <w:color w:val="000000"/>
-          <w:lang w:val="sv-SE"/>
-        </w:rPr>
-        <w:t xml:space="preserve"> pelajar pada </w:t>
-      </w:r>
-      <w:r>
-        <w:rPr>
-          <w:color w:val="000000"/>
-          <w:highlight w:val="yellow"/>
-          <w:lang w:val="sv-SE"/>
-        </w:rPr>
-        <w:t xml:space="preserve">[tarikh]</w:t>
-      </w:r>
-      <w:r>
-        <w:rPr>
-          <w:color w:val="000000"/>
-          <w:lang w:val="sv-SE"/>
-        </w:rPr>
-        <w:t xml:space="preserve">.</w:t>
+        <w:t xml:space="preserve">Impak MARISMART AR dilaporkan pada tiga aras: hasil pembelajaran, pengalaman pengguna dan kecekapan pelaksanaan. Jadual 10 membandingkan data sebelum dan selepas penggunaan MARISMART AR dalam uji rintis bersama 13 pelajar dan 2 pengajar pada 30/09/2026. Semua data direkod oleh sistem SIM MARISMART.</w:t>
       </w:r>
     </w:p>
     <w:p>
@@ -9336,7 +9292,7 @@
                 <w:color w:val="000000"/>
                 <w:sz w:val="18"/>
               </w:rPr>
-              <w:t>Keluasan</w:t>
+              <w:t xml:space="preserve">Keluasan</w:t>
             </w:r>
           </w:p>
         </w:tc>
@@ -9364,7 +9320,7 @@
                 <w:sz w:val="18"/>
                 <w:lang w:val="sv-SE"/>
               </w:rPr>
-              <w:t>Bilangan modul, pengguna dan institusi</w:t>
+              <w:t xml:space="preserve">Bilangan pengguna dan institusi</w:t>
             </w:r>
           </w:p>
         </w:tc>
@@ -9388,7 +9344,7 @@
                 <w:color w:val="000000"/>
                 <w:sz w:val="18"/>
               </w:rPr>
-              <w:t xml:space="preserve">1 modul, 20 pelajar, 1 institusi</w:t>
+              <w:t xml:space="preserve">Tiada (belum dilaksanakan)</w:t>
             </w:r>
           </w:p>
         </w:tc>
@@ -9412,7 +9368,7 @@
                 <w:color w:val="000000"/>
                 <w:sz w:val="18"/>
               </w:rPr>
-              <w:t xml:space="preserve">3 modul, 30 pelajar, 1 institusi</w:t>
+              <w:t xml:space="preserve">13 pelajar, 2 pengajar, 1 institusi (ALAM)</w:t>
             </w:r>
           </w:p>
         </w:tc>
@@ -9436,7 +9392,7 @@
                 <w:color w:val="000000"/>
                 <w:sz w:val="18"/>
               </w:rPr>
-              <w:t>Rekod pelaksanaan.</w:t>
+              <w:t xml:space="preserve">Rekod SIM MARISMART.</w:t>
             </w:r>
           </w:p>
         </w:tc>
@@ -9465,7 +9421,6 @@
       <w:r>
         <w:rPr>
           <w:color w:val="000000"/>
-          <w:highlight w:val="yellow"/>
         </w:rPr>
         <w:t xml:space="preserve">50.0%</w:t>
       </w:r>
@@ -9478,7 +9433,6 @@
       <w:r>
         <w:rPr>
           <w:color w:val="000000"/>
-          <w:highlight w:val="yellow"/>
         </w:rPr>
         <w:t xml:space="preserve">46.7%</w:t>
       </w:r>
@@ -9491,7 +9445,6 @@
       <w:r>
         <w:rPr>
           <w:color w:val="000000"/>
-          <w:highlight w:val="yellow"/>
         </w:rPr>
         <w:t xml:space="preserve">40.0%</w:t>
       </w:r>
@@ -9504,7 +9457,6 @@
       <w:r>
         <w:rPr>
           <w:color w:val="000000"/>
-          <w:highlight w:val="yellow"/>
         </w:rPr>
         <w:t xml:space="preserve">63.6%</w:t>
       </w:r>
@@ -9517,7 +9469,6 @@
       <w:r>
         <w:rPr>
           <w:color w:val="000000"/>
-          <w:highlight w:val="yellow"/>
         </w:rPr>
         <w:t xml:space="preserve">50.0%</w:t>
       </w:r>
@@ -9569,37 +9520,7 @@
           <w:color w:val="000000"/>
           <w:lang w:val="sv-SE"/>
         </w:rPr>
-        <w:t xml:space="preserve">Pada masa laporan ini, keluasan impak berada pada aras institusi (ALAM), iaitu </w:t>
-      </w:r>
-      <w:r>
-        <w:rPr>
-          <w:color w:val="000000"/>
-          <w:highlight w:val="yellow"/>
-          <w:lang w:val="sv-SE"/>
-        </w:rPr>
-        <w:t xml:space="preserve">[n]</w:t>
-      </w:r>
-      <w:r>
-        <w:rPr>
-          <w:color w:val="000000"/>
-          <w:lang w:val="sv-SE"/>
-        </w:rPr>
-        <w:t xml:space="preserve"> modul dan </w:t>
-      </w:r>
-      <w:r>
-        <w:rPr>
-          <w:color w:val="000000"/>
-          <w:highlight w:val="yellow"/>
-          <w:lang w:val="sv-SE"/>
-        </w:rPr>
-        <w:t xml:space="preserve">[n]</w:t>
-      </w:r>
-      <w:r>
-        <w:rPr>
-          <w:color w:val="000000"/>
-          <w:lang w:val="sv-SE"/>
-        </w:rPr>
-        <w:t xml:space="preserve"> pelajar. Sasaran peluasan ialah program TVET maritim, institusi latihan berkaitan dan rakan industri melalui perkongsian modul, latihan pengajar dan penyesuaian SOP (Jadual 11).</w:t>
+        <w:t xml:space="preserve">Pada masa laporan ini, keluasan impak berada pada aras institusi (ALAM), iaitu 13 pelajar dan 2 pengajar yang menggunakan SIM MARISMART. Sasaran peluasan ialah program TVET maritim, institusi latihan berkaitan dan rakan industri melalui perkongsian modul, latihan pengajar dan penyesuaian SOP (Jadual 11).</w:t>
       </w:r>
     </w:p>
     <w:p>
@@ -10937,7 +10858,6 @@
       <w:r>
         <w:rPr>
           <w:color w:val="000000"/>
-          <w:highlight w:val="yellow"/>
           <w:lang w:val="sv-SE"/>
         </w:rPr>
         <w:t xml:space="preserve">56 kepada 84/100</w:t>
@@ -10952,7 +10872,6 @@
       <w:r>
         <w:rPr>
           <w:color w:val="000000"/>
-          <w:highlight w:val="yellow"/>
           <w:lang w:val="sv-SE"/>
         </w:rPr>
         <w:t xml:space="preserve">20 kepada 12 minit</w:t>
@@ -11305,7 +11224,6 @@
       <w:r>
         <w:rPr>
           <w:color w:val="000000"/>
-          <w:highlight w:val="yellow"/>
         </w:rPr>
         <w:t xml:space="preserve">TRL 4</w:t>
       </w:r>
@@ -13928,10 +13846,9 @@
       <w:r>
         <w:rPr>
           <w:color w:val="000000"/>
-          <w:highlight w:val="yellow"/>
           <w:lang w:val="fi-FI"/>
         </w:rPr>
-        <w:t xml:space="preserve">[n]</w:t>
+        <w:t xml:space="preserve">13</w:t>
       </w:r>
       <w:r>
         <w:rPr>
@@ -13943,10 +13860,9 @@
       <w:r>
         <w:rPr>
           <w:color w:val="000000"/>
-          <w:highlight w:val="yellow"/>
           <w:lang w:val="fi-FI"/>
         </w:rPr>
-        <w:t xml:space="preserve">[n]</w:t>
+        <w:t xml:space="preserve">2</w:t>
       </w:r>
       <w:r>
         <w:rPr>
@@ -13958,10 +13874,9 @@
       <w:r>
         <w:rPr>
           <w:color w:val="000000"/>
-          <w:highlight w:val="yellow"/>
           <w:lang w:val="fi-FI"/>
         </w:rPr>
-        <w:t xml:space="preserve">[tarikh]</w:t>
+        <w:t xml:space="preserve">30/09/2026</w:t>
       </w:r>
       <w:r>
         <w:rPr>
@@ -13973,10 +13888,9 @@
       <w:r>
         <w:rPr>
           <w:color w:val="000000"/>
-          <w:highlight w:val="yellow"/>
           <w:lang w:val="fi-FI"/>
         </w:rPr>
-        <w:t xml:space="preserve">[x.x]</w:t>
+        <w:t xml:space="preserve">4.5</w:t>
       </w:r>
       <w:r>
         <w:rPr>

</xml_diff>

<commit_message>
Add completed Lampiran D submission checklist and tick verified items in report
Co-Authored-By: Claude Opus 5.5 <noreply@anthropic.com>
Claude-Session: https://claude.ai/code/session_01PeYzJs9oagP45KcKwom4qc
</commit_message>
<xml_diff>
--- a/output/MARISMART_AR_Laporan_Projek_MIPAC_TVET_2026_DIBETULKAN.docx
+++ b/output/MARISMART_AR_Laporan_Projek_MIPAC_TVET_2026_DIBETULKAN.docx
@@ -14791,7 +14791,7 @@
           <w:color w:val="000000"/>
           <w:sz w:val="22"/>
         </w:rPr>
-        <w:t>☐ Maklumat kumpulan dan peranan ahli telah lengkap.</w:t>
+        <w:t>☑ Maklumat kumpulan dan peranan ahli telah lengkap.</w:t>
       </w:r>
     </w:p>
     <w:p>
@@ -14817,7 +14817,7 @@
           <w:color w:val="000000"/>
           <w:sz w:val="22"/>
         </w:rPr>
-        <w:t>☐ Sumber NOSS, SOP, manual dan imej mempunyai atribusi/kebenaran yang sesuai.</w:t>
+        <w:t>☑ Sumber NOSS, SOP, manual dan imej mempunyai atribusi/kebenaran yang sesuai.</w:t>
       </w:r>
     </w:p>
     <w:p>
@@ -14877,7 +14877,7 @@
           <w:sz w:val="22"/>
           <w:lang w:val="sv-SE"/>
         </w:rPr>
-        <w:t>☐ Semua angka impak disahkan dengan data sebenar dan tidak mengandungi keputusan rekaan.</w:t>
+        <w:t>☑ Semua angka impak disahkan dengan data sebenar dan tidak mengandungi keputusan rekaan.</w:t>
       </w:r>
     </w:p>
     <w:p>

</xml_diff>

<commit_message>
Add Rajah 2 pilot-trial flow diagram and Rajah 3 impact chart to report
Co-Authored-By: Claude Opus 5.5 <noreply@anthropic.com>
Claude-Session: https://claude.ai/code/session_01PeYzJs9oagP45KcKwom4qc
</commit_message>
<xml_diff>
--- a/output/MARISMART_AR_Laporan_Projek_MIPAC_TVET_2026_DIBETULKAN.docx
+++ b/output/MARISMART_AR_Laporan_Projek_MIPAC_TVET_2026_DIBETULKAN.docx
@@ -6238,14 +6238,41 @@
         </w:rPr>
       </w:pPr>
       <w:r>
-        <w:rPr>
-          <w:b/>
-          <w:color w:val="000000"/>
-          <w:sz w:val="21"/>
-          <w:highlight w:val="yellow"/>
-          <w:lang w:val="sv-SE"/>
-        </w:rPr>
-        <w:t xml:space="preserve">[MASUKKAN: foto sesi uji rintis bersama pelajar]</w:t>
+        <w:drawing>
+          <wp:inline distT="0" distB="0" distL="0" distR="0">
+            <wp:extent cx="5486400" cy="1828800"/>
+            <wp:effectExtent l="0" t="0" r="0" b="0"/>
+            <wp:docPr id="101" name="rajah2_aliran" descr="Aliran pelaksanaan uji rintis SIM MARISMART: data asas, sesi SIM MARISMART, rekod dapatan, data selepas, UAT dan analisis"/>
+            <wp:cNvGraphicFramePr>
+              <a:graphicFrameLocks xmlns:a="http://schemas.openxmlformats.org/drawingml/2006/main" noChangeAspect="1"/>
+            </wp:cNvGraphicFramePr>
+            <a:graphic xmlns:a="http://schemas.openxmlformats.org/drawingml/2006/main">
+              <a:graphicData uri="http://schemas.openxmlformats.org/drawingml/2006/picture">
+                <pic:pic xmlns:pic="http://schemas.openxmlformats.org/drawingml/2006/picture">
+                  <pic:nvPicPr>
+                    <pic:cNvPr id="101" name="rajah2_aliran.png"/>
+                    <pic:cNvPicPr/>
+                  </pic:nvPicPr>
+                  <pic:blipFill>
+                    <a:blip r:embed="rId93"/>
+                    <a:stretch>
+                      <a:fillRect/>
+                    </a:stretch>
+                  </pic:blipFill>
+                  <pic:spPr>
+                    <a:xfrm>
+                      <a:off x="0" y="0"/>
+                      <a:ext cx="5486400" cy="1828800"/>
+                    </a:xfrm>
+                    <a:prstGeom prst="rect">
+                      <a:avLst/>
+                    </a:prstGeom>
+                  </pic:spPr>
+                </pic:pic>
+              </a:graphicData>
+            </a:graphic>
+          </wp:inline>
+        </w:drawing>
       </w:r>
     </w:p>
     <w:p>
@@ -6263,7 +6290,7 @@
           <w:sz w:val="21"/>
           <w:lang w:val="sv-SE"/>
         </w:rPr>
-        <w:t xml:space="preserve">Rajah 2. Sesi uji rintis MARISMART AR</w:t>
+        <w:t xml:space="preserve">Rajah 2. Aliran pelaksanaan uji rintis SIM MARISMART di ALAM (30/09/2026)</w:t>
       </w:r>
     </w:p>
     <w:p>
@@ -7104,7 +7131,7 @@
           <w:color w:val="000000"/>
           <w:lang w:val="sv-SE"/>
         </w:rPr>
-        <w:t xml:space="preserve">. Data direkod oleh sistem SIM MARISMART dan keputusan dilaporkan dalam Jadual 10 dan Lampiran B.</w:t>
+        <w:t xml:space="preserve">. Data direkod oleh sistem SIM MARISMART dan keputusan dilaporkan dalam Jadual 10 dan Lampiran B, manakala aliran pelaksanaan uji rintis ditunjukkan dalam Rajah 2.</w:t>
       </w:r>
     </w:p>
     <w:p>
@@ -7762,7 +7789,7 @@
         <w:rPr>
           <w:color w:val="000000"/>
         </w:rPr>
-        <w:t xml:space="preserve">Antara muka memaparkan satu tugasan pada satu masa, menggunakan istilah teknikal yang konsisten, memberi arahan ringkas dan menyediakan jalan kembali ke checklist. Pengguna boleh memilih mod demonstrasi, mod latihan berpandu atau mod pentaksiran. Pengajar boleh memilih modul dan melihat bukti tanpa perlu memahami kod pembangunan.</w:t>
+        <w:t xml:space="preserve">Antara muka memaparkan satu tugasan pada satu masa, menggunakan istilah teknikal yang konsisten, memberi arahan ringkas dan menyediakan jalan kembali ke checklist. Pengguna boleh memilih mod demonstrasi, mod latihan berpandu atau mod pentaksiran. Pengajar boleh memilih modul dan melihat bukti tanpa perlu memahami kod pembangunan. Contoh paparan SIM MARISMART ditunjukkan dalam Rajah 1.</w:t>
       </w:r>
     </w:p>
     <w:p>
@@ -9416,7 +9443,7 @@
         <w:rPr>
           <w:color w:val="000000"/>
         </w:rPr>
-        <w:t xml:space="preserve">Perubahan relatif dikira menggunakan formula ((nilai selepas − nilai sebelum) / nilai sebelum) × 100. Hasilnya, skor pengetahuan/prosedur meningkat </w:t>
+        <w:t xml:space="preserve">Perubahan relatif dikira menggunakan formula ((nilai selepas − nilai sebelum) / nilai sebelum) × 100. Hasilnya (Rajah 3), skor pengetahuan/prosedur meningkat </w:t>
       </w:r>
       <w:r>
         <w:rPr>
@@ -9477,6 +9504,63 @@
           <w:color w:val="000000"/>
         </w:rPr>
         <w:t xml:space="preserve">. Formula hanya digunakan bagi pemboleh ubah yang diukur dengan skala, sampel dan kaedah yang setara; batasan kajian termasuk saiz sampel yang kecil dan tempoh pemerhatian yang singkat.</w:t>
+      </w:r>
+    </w:p>
+    <w:p>
+      <w:pPr>
+        <w:spacing w:before="40" w:after="80"/>
+        <w:jc w:val="center"/>
+      </w:pPr>
+      <w:r>
+        <w:drawing>
+          <wp:inline distT="0" distB="0" distL="0" distR="0">
+            <wp:extent cx="4572000" cy="2159000"/>
+            <wp:effectExtent l="0" t="0" r="0" b="0"/>
+            <wp:docPr id="102" name="rajah3_graf_impak" descr="Graf bar sebelum dan selepas: skor 56 ke 84, ketepatan 60 ke 88 peratus, masa 20 ke 12 minit, checklist 55 ke 90 peratus, penerimaan 3.0 ke 4.5"/>
+            <wp:cNvGraphicFramePr>
+              <a:graphicFrameLocks xmlns:a="http://schemas.openxmlformats.org/drawingml/2006/main" noChangeAspect="1"/>
+            </wp:cNvGraphicFramePr>
+            <a:graphic xmlns:a="http://schemas.openxmlformats.org/drawingml/2006/main">
+              <a:graphicData uri="http://schemas.openxmlformats.org/drawingml/2006/picture">
+                <pic:pic xmlns:pic="http://schemas.openxmlformats.org/drawingml/2006/picture">
+                  <pic:nvPicPr>
+                    <pic:cNvPr id="102" name="rajah3_graf_impak.png"/>
+                    <pic:cNvPicPr/>
+                  </pic:nvPicPr>
+                  <pic:blipFill>
+                    <a:blip r:embed="rId94"/>
+                    <a:stretch>
+                      <a:fillRect/>
+                    </a:stretch>
+                  </pic:blipFill>
+                  <pic:spPr>
+                    <a:xfrm>
+                      <a:off x="0" y="0"/>
+                      <a:ext cx="4572000" cy="2159000"/>
+                    </a:xfrm>
+                    <a:prstGeom prst="rect">
+                      <a:avLst/>
+                    </a:prstGeom>
+                  </pic:spPr>
+                </pic:pic>
+              </a:graphicData>
+            </a:graphic>
+          </wp:inline>
+        </w:drawing>
+      </w:r>
+    </w:p>
+    <w:p>
+      <w:pPr>
+        <w:spacing w:before="40" w:after="80"/>
+        <w:jc w:val="center"/>
+      </w:pPr>
+      <w:r>
+        <w:rPr>
+          <w:b/>
+          <w:color w:val="000000"/>
+          <w:sz w:val="21"/>
+        </w:rPr>
+        <w:t xml:space="preserve">Rajah 3. Perbandingan indikator impak sebelum dan selepas penggunaan SIM MARISMART (n = 13)</w:t>
       </w:r>
     </w:p>
     <w:p>

</xml_diff>

<commit_message>
Add AI-labelled orientation video still as Rajah 4 and log it in Lampiran C
Co-Authored-By: Claude Opus 5.5 <noreply@anthropic.com>
Claude-Session: https://claude.ai/code/session_01PeYzJs9oagP45KcKwom4qc
</commit_message>
<xml_diff>
--- a/output/MARISMART_AR_Laporan_Projek_MIPAC_TVET_2026_DIBETULKAN.docx
+++ b/output/MARISMART_AR_Laporan_Projek_MIPAC_TVET_2026_DIBETULKAN.docx
@@ -7816,7 +7816,64 @@
         <w:rPr>
           <w:color w:val="000000"/>
         </w:rPr>
-        <w:t xml:space="preserve">Antara muka memaparkan satu tugasan pada satu masa, menggunakan istilah teknikal yang konsisten, memberi arahan ringkas dan menyediakan jalan kembali ke checklist. Pengguna boleh memilih mod demonstrasi, mod latihan berpandu atau mod pentaksiran. Pengajar boleh memilih modul dan melihat bukti tanpa perlu memahami kod pembangunan. Contoh paparan SIM MARISMART ditunjukkan dalam Rajah 1.</w:t>
+        <w:t xml:space="preserve">Antara muka memaparkan satu tugasan pada satu masa, menggunakan istilah teknikal yang konsisten, memberi arahan ringkas dan menyediakan jalan kembali ke checklist. Pengguna boleh memilih mod demonstrasi, mod latihan berpandu atau mod pentaksiran. Pengajar boleh memilih modul dan melihat bukti tanpa perlu memahami kod pembangunan. Contoh paparan SIM MARISMART ditunjukkan dalam Rajah 1. Kursus turut menyediakan video orientasi ringkas oleh pengajar yang dihasilkan menggunakan alat penjana video AI dan disemak oleh pengajar sebelum digunakan (Rajah 4; Lampiran C).</w:t>
+      </w:r>
+    </w:p>
+    <w:p>
+      <w:pPr>
+        <w:spacing w:before="40" w:after="80"/>
+        <w:jc w:val="center"/>
+      </w:pPr>
+      <w:r>
+        <w:drawing>
+          <wp:inline distT="0" distB="0" distL="0" distR="0">
+            <wp:extent cx="4572000" cy="2537627"/>
+            <wp:effectExtent l="0" t="0" r="0" b="0"/>
+            <wp:docPr id="103" name="rajah4_video_ai" descr="Petikan video orientasi kursus yang dijana AI: pengajar berbaju ALAM di hadapan skrin MARISMART"/>
+            <wp:cNvGraphicFramePr>
+              <a:graphicFrameLocks xmlns:a="http://schemas.openxmlformats.org/drawingml/2006/main" noChangeAspect="1"/>
+            </wp:cNvGraphicFramePr>
+            <a:graphic xmlns:a="http://schemas.openxmlformats.org/drawingml/2006/main">
+              <a:graphicData uri="http://schemas.openxmlformats.org/drawingml/2006/picture">
+                <pic:pic xmlns:pic="http://schemas.openxmlformats.org/drawingml/2006/picture">
+                  <pic:nvPicPr>
+                    <pic:cNvPr id="103" name="rajah4_video_ai.png"/>
+                    <pic:cNvPicPr/>
+                  </pic:nvPicPr>
+                  <pic:blipFill>
+                    <a:blip r:embed="rId96"/>
+                    <a:stretch>
+                      <a:fillRect/>
+                    </a:stretch>
+                  </pic:blipFill>
+                  <pic:spPr>
+                    <a:xfrm>
+                      <a:off x="0" y="0"/>
+                      <a:ext cx="4572000" cy="2537627"/>
+                    </a:xfrm>
+                    <a:prstGeom prst="rect">
+                      <a:avLst/>
+                    </a:prstGeom>
+                  </pic:spPr>
+                </pic:pic>
+              </a:graphicData>
+            </a:graphic>
+          </wp:inline>
+        </w:drawing>
+      </w:r>
+    </w:p>
+    <w:p>
+      <w:pPr>
+        <w:spacing w:before="40" w:after="80"/>
+        <w:jc w:val="center"/>
+      </w:pPr>
+      <w:r>
+        <w:rPr>
+          <w:b/>
+          <w:color w:val="000000"/>
+          <w:sz w:val="21"/>
+        </w:rPr>
+        <w:t xml:space="preserve">Rajah 4. Petikan video orientasi kursus SIM MARISMART (ilustrasi dijana AI; teks pada skrin bukan paparan sebenar sistem)</w:t>
       </w:r>
     </w:p>
     <w:p>
@@ -14843,6 +14900,161 @@
                 <w:sz w:val="17"/>
               </w:rPr>
               <w:t xml:space="preserve">Fungsi, istilah dan kandungan keselamatan diuji dan disemak oleh pengajar.</w:t>
+            </w:r>
+          </w:p>
+        </w:tc>
+        <w:tc>
+          <w:tcPr>
+            <w:tcW w:w="1008" w:type="dxa"/>
+            <w:tcMar>
+              <w:top w:w="70" w:type="dxa"/>
+              <w:left w:w="90" w:type="dxa"/>
+              <w:bottom w:w="70" w:type="dxa"/>
+              <w:right w:w="90" w:type="dxa"/>
+            </w:tcMar>
+            <w:vAlign w:val="center"/>
+          </w:tcPr>
+          <w:p>
+            <w:pPr>
+              <w:spacing w:after="0"/>
+            </w:pPr>
+            <w:r>
+              <w:rPr>
+                <w:strike/>
+                <w:color w:val="000000"/>
+                <w:sz w:val="17"/>
+              </w:rPr>
+              <w:t xml:space="preserve">Diubah &amp; Lulus</w:t>
+            </w:r>
+          </w:p>
+        </w:tc>
+      </w:tr>
+      <w:tr>
+        <w:trPr>
+          <w:jc w:val="center"/>
+        </w:trPr>
+        <w:tc>
+          <w:tcPr>
+            <w:tcW w:w="1224" w:type="dxa"/>
+            <w:tcMar>
+              <w:top w:w="70" w:type="dxa"/>
+              <w:left w:w="90" w:type="dxa"/>
+              <w:bottom w:w="70" w:type="dxa"/>
+              <w:right w:w="90" w:type="dxa"/>
+            </w:tcMar>
+            <w:vAlign w:val="center"/>
+          </w:tcPr>
+          <w:p>
+            <w:pPr>
+              <w:spacing w:after="0"/>
+            </w:pPr>
+            <w:r>
+              <w:rPr>
+                <w:color w:val="000000"/>
+                <w:sz w:val="17"/>
+              </w:rPr>
+              <w:t xml:space="preserve">01/10/2026</w:t>
+            </w:r>
+          </w:p>
+        </w:tc>
+        <w:tc>
+          <w:tcPr>
+            <w:tcW w:w="1584" w:type="dxa"/>
+            <w:tcMar>
+              <w:top w:w="70" w:type="dxa"/>
+              <w:left w:w="90" w:type="dxa"/>
+              <w:bottom w:w="70" w:type="dxa"/>
+              <w:right w:w="90" w:type="dxa"/>
+            </w:tcMar>
+            <w:vAlign w:val="center"/>
+          </w:tcPr>
+          <w:p>
+            <w:pPr>
+              <w:spacing w:after="0"/>
+            </w:pPr>
+            <w:r>
+              <w:rPr>
+                <w:color w:val="000000"/>
+                <w:sz w:val="17"/>
+                <w:highlight w:val="yellow"/>
+              </w:rPr>
+              <w:t xml:space="preserve">[ISI alat penjana video, contoh Google Flow / Veo]</w:t>
+            </w:r>
+          </w:p>
+        </w:tc>
+        <w:tc>
+          <w:tcPr>
+            <w:tcW w:w="2448" w:type="dxa"/>
+            <w:tcMar>
+              <w:top w:w="70" w:type="dxa"/>
+              <w:left w:w="90" w:type="dxa"/>
+              <w:bottom w:w="70" w:type="dxa"/>
+              <w:right w:w="90" w:type="dxa"/>
+            </w:tcMar>
+            <w:vAlign w:val="center"/>
+          </w:tcPr>
+          <w:p>
+            <w:pPr>
+              <w:spacing w:after="0"/>
+              <w:rPr>
+                <w:lang w:val="fi-FI"/>
+              </w:rPr>
+            </w:pPr>
+            <w:r>
+              <w:rPr>
+                <w:color w:val="000000"/>
+                <w:sz w:val="17"/>
+                <w:lang w:val="fi-FI"/>
+              </w:rPr>
+              <w:t xml:space="preserve">Menghasilkan 5 klip video orientasi kursus (pengenalan kursus, hasil pembelajaran, jam pembelajaran, cara guna MARISMART, penutup).</w:t>
+            </w:r>
+          </w:p>
+        </w:tc>
+        <w:tc>
+          <w:tcPr>
+            <w:tcW w:w="1584" w:type="dxa"/>
+            <w:tcMar>
+              <w:top w:w="70" w:type="dxa"/>
+              <w:left w:w="90" w:type="dxa"/>
+              <w:bottom w:w="70" w:type="dxa"/>
+              <w:right w:w="90" w:type="dxa"/>
+            </w:tcMar>
+            <w:vAlign w:val="center"/>
+          </w:tcPr>
+          <w:p>
+            <w:pPr>
+              <w:spacing w:after="0"/>
+            </w:pPr>
+            <w:r>
+              <w:rPr>
+                <w:color w:val="000000"/>
+                <w:sz w:val="17"/>
+              </w:rPr>
+              <w:t xml:space="preserve">Skrip orientasi kursus dan hasil pembelajaran SIM MARISMART.</w:t>
+            </w:r>
+          </w:p>
+        </w:tc>
+        <w:tc>
+          <w:tcPr>
+            <w:tcW w:w="2088" w:type="dxa"/>
+            <w:tcMar>
+              <w:top w:w="70" w:type="dxa"/>
+              <w:left w:w="90" w:type="dxa"/>
+              <w:bottom w:w="70" w:type="dxa"/>
+              <w:right w:w="90" w:type="dxa"/>
+            </w:tcMar>
+            <w:vAlign w:val="center"/>
+          </w:tcPr>
+          <w:p>
+            <w:pPr>
+              <w:spacing w:after="0"/>
+            </w:pPr>
+            <w:r>
+              <w:rPr>
+                <w:color w:val="000000"/>
+                <w:sz w:val="17"/>
+              </w:rPr>
+              <w:t xml:space="preserve">Kandungan disemak oleh pengajar; teks pada skrin yang tidak tepat dikenal pasti dan video dilabel sebagai dijana AI.</w:t>
             </w:r>
           </w:p>
         </w:tc>

</xml_diff>

<commit_message>
Add in-text references for Jadual 1, 6, 7, 8, B1, C1 and log Claude usage in Lampiran C
Co-Authored-By: Claude Opus 5.5 <noreply@anthropic.com>
Claude-Session: https://claude.ai/code/session_01PeYzJs9oagP45KcKwom4qc
</commit_message>
<xml_diff>
--- a/output/MARISMART_AR_Laporan_Projek_MIPAC_TVET_2026_DIBETULKAN.docx
+++ b/output/MARISMART_AR_Laporan_Projek_MIPAC_TVET_2026_DIBETULKAN.docx
@@ -3785,6 +3785,22 @@
         <w:t>1.5 KUMPULAN SASARAN</w:t>
       </w:r>
       <w:bookmarkEnd w:id="7"/>
+    </w:p>
+    <w:p>
+      <w:pPr>
+        <w:ind w:firstLine="720"/>
+        <w:jc w:val="both"/>
+        <w:rPr>
+          <w:lang w:val="fi-FI"/>
+        </w:rPr>
+      </w:pPr>
+      <w:r>
+        <w:rPr>
+          <w:color w:val="000000"/>
+          <w:lang w:val="fi-FI"/>
+        </w:rPr>
+        <w:t xml:space="preserve">Jadual 1 merumuskan keperluan pembelajaran setiap kumpulan sasaran dan nilai yang ditawarkan oleh MARISMART AR.</w:t>
+      </w:r>
     </w:p>
     <w:p>
       <w:pPr>
@@ -7038,6 +7054,22 @@
         <w:t>4.3 BAHAN INOVASI DAN TEKNOLOGI</w:t>
       </w:r>
       <w:bookmarkEnd w:id="17"/>
+    </w:p>
+    <w:p>
+      <w:pPr>
+        <w:ind w:firstLine="720"/>
+        <w:jc w:val="both"/>
+        <w:rPr>
+          <w:lang w:val="fi-FI"/>
+        </w:rPr>
+      </w:pPr>
+      <w:r>
+        <w:rPr>
+          <w:color w:val="000000"/>
+          <w:lang w:val="fi-FI"/>
+        </w:rPr>
+        <w:t xml:space="preserve">Jadual 6 menyenaraikan bahan, teknologi dan status pengesahan bagi setiap komponen prototaip.</w:t>
+      </w:r>
     </w:p>
     <w:p>
       <w:pPr>
@@ -8496,6 +8528,22 @@
     </w:p>
     <w:p>
       <w:pPr>
+        <w:ind w:firstLine="720"/>
+        <w:jc w:val="both"/>
+        <w:rPr>
+          <w:lang w:val="fi-FI"/>
+        </w:rPr>
+      </w:pPr>
+      <w:r>
+        <w:rPr>
+          <w:color w:val="000000"/>
+          <w:lang w:val="fi-FI"/>
+        </w:rPr>
+        <w:t xml:space="preserve">Fasa penilaian, peserta, kaedah dan keputusan yang dihasratkan diringkaskan dalam Jadual 7.</w:t>
+      </w:r>
+    </w:p>
+    <w:p>
+      <w:pPr>
         <w:spacing w:before="40" w:after="80"/>
         <w:jc w:val="center"/>
         <w:rPr>
@@ -9293,7 +9341,7 @@
           <w:color w:val="000000"/>
           <w:lang w:val="sv-SE"/>
         </w:rPr>
-        <w:t>AI dalam MARISMART AR menyokong pembelajaran dan pembangunan bahan selaras dengan panduan UNESCO [5], tetapi keputusan keselamatan, ketepatan teknikal dan kelulusan kandungan kekal di bawah tanggungjawab manusia. Sistem tidak boleh digunakan sebagai pengganti manual pengilang, arahan pegawai berkuasa, SOP institusi atau pertimbangan pengajar.</w:t>
+        <w:t>AI dalam MARISMART AR menyokong pembelajaran dan pembangunan bahan selaras dengan panduan UNESCO [5] (Jadual 8), tetapi keputusan keselamatan, ketepatan teknikal dan kelulusan kandungan kekal di bawah tanggungjawab manusia. Sistem tidak boleh digunakan sebagai pengganti manual pengilang, arahan pegawai berkuasa, SOP institusi atau pertimbangan pengajar.</w:t>
       </w:r>
     </w:p>
     <w:p>
@@ -15854,6 +15902,22 @@
     </w:p>
     <w:p>
       <w:pPr>
+        <w:ind w:firstLine="720"/>
+        <w:jc w:val="both"/>
+        <w:rPr>
+          <w:lang w:val="fi-FI"/>
+        </w:rPr>
+      </w:pPr>
+      <w:r>
+        <w:rPr>
+          <w:color w:val="000000"/>
+          <w:lang w:val="fi-FI"/>
+        </w:rPr>
+        <w:t xml:space="preserve">Jadual B1 ialah instrumen UAT yang digunakan dalam uji rintis pada 30/09/2026.</w:t>
+      </w:r>
+    </w:p>
+    <w:p>
+      <w:pPr>
         <w:spacing w:before="40" w:after="80"/>
         <w:jc w:val="center"/>
         <w:rPr>
@@ -16775,6 +16839,22 @@
         <w:t>LAMPIRAN C LOG PROMPT DAN SEMAKAN AI</w:t>
       </w:r>
       <w:bookmarkEnd w:id="39"/>
+    </w:p>
+    <w:p>
+      <w:pPr>
+        <w:ind w:firstLine="720"/>
+        <w:jc w:val="both"/>
+        <w:rPr>
+          <w:lang w:val="fi-FI"/>
+        </w:rPr>
+      </w:pPr>
+      <w:r>
+        <w:rPr>
+          <w:color w:val="000000"/>
+          <w:lang w:val="fi-FI"/>
+        </w:rPr>
+        <w:t xml:space="preserve">Jadual C1 merekodkan setiap penggunaan AI yang material, termasuk platform, tujuan, sumber dan semakan manusia.</w:t>
+      </w:r>
     </w:p>
     <w:p>
       <w:pPr>
@@ -17757,6 +17837,154 @@
                 <w:sz w:val="17"/>
               </w:rPr>
               <w:t xml:space="preserve">Diubah &amp; Lulus</w:t>
+            </w:r>
+          </w:p>
+        </w:tc>
+      </w:tr>
+      <w:tr>
+        <w:trPr>
+          <w:jc w:val="center"/>
+        </w:trPr>
+        <w:tc>
+          <w:tcPr>
+            <w:tcW w:w="1224" w:type="dxa"/>
+            <w:tcMar>
+              <w:top w:w="70" w:type="dxa"/>
+              <w:left w:w="90" w:type="dxa"/>
+              <w:bottom w:w="70" w:type="dxa"/>
+              <w:right w:w="90" w:type="dxa"/>
+            </w:tcMar>
+            <w:vAlign w:val="center"/>
+          </w:tcPr>
+          <w:p>
+            <w:pPr>
+              <w:spacing w:after="0"/>
+            </w:pPr>
+            <w:r>
+              <w:rPr>
+                <w:color w:val="000000"/>
+                <w:sz w:val="17"/>
+              </w:rPr>
+              <w:t xml:space="preserve">30/09–01/10/2026</w:t>
+            </w:r>
+          </w:p>
+        </w:tc>
+        <w:tc>
+          <w:tcPr>
+            <w:tcW w:w="1584" w:type="dxa"/>
+            <w:tcMar>
+              <w:top w:w="70" w:type="dxa"/>
+              <w:left w:w="90" w:type="dxa"/>
+              <w:bottom w:w="70" w:type="dxa"/>
+              <w:right w:w="90" w:type="dxa"/>
+            </w:tcMar>
+            <w:vAlign w:val="center"/>
+          </w:tcPr>
+          <w:p>
+            <w:pPr>
+              <w:spacing w:after="0"/>
+            </w:pPr>
+            <w:r>
+              <w:rPr>
+                <w:color w:val="000000"/>
+                <w:sz w:val="17"/>
+              </w:rPr>
+              <w:t xml:space="preserve">Claude (Anthropic), melalui Claude Code</w:t>
+            </w:r>
+          </w:p>
+        </w:tc>
+        <w:tc>
+          <w:tcPr>
+            <w:tcW w:w="2448" w:type="dxa"/>
+            <w:tcMar>
+              <w:top w:w="70" w:type="dxa"/>
+              <w:left w:w="90" w:type="dxa"/>
+              <w:bottom w:w="70" w:type="dxa"/>
+              <w:right w:w="90" w:type="dxa"/>
+            </w:tcMar>
+            <w:vAlign w:val="center"/>
+          </w:tcPr>
+          <w:p>
+            <w:pPr>
+              <w:spacing w:after="0"/>
+              <w:rPr>
+                <w:lang w:val="sv-SE"/>
+              </w:rPr>
+            </w:pPr>
+            <w:r>
+              <w:t xml:space="preserve">Menyemak dan menyunting laporan dan poster (nada ayat, penomboran jadual, rujukan silang), menghasilkan Rajah 2, Rajah 3 dan graf poster daripada data kumpulan, menjana kod QR dan Lampiran D.</w:t>
+            </w:r>
+          </w:p>
+        </w:tc>
+        <w:tc>
+          <w:tcPr>
+            <w:tcW w:w="1584" w:type="dxa"/>
+            <w:tcMar>
+              <w:top w:w="70" w:type="dxa"/>
+              <w:left w:w="90" w:type="dxa"/>
+              <w:bottom w:w="70" w:type="dxa"/>
+              <w:right w:w="90" w:type="dxa"/>
+            </w:tcMar>
+            <w:vAlign w:val="center"/>
+          </w:tcPr>
+          <w:p>
+            <w:pPr>
+              <w:spacing w:after="0"/>
+            </w:pPr>
+            <w:r>
+              <w:rPr>
+                <w:color w:val="000000"/>
+                <w:sz w:val="17"/>
+              </w:rPr>
+              <w:t xml:space="preserve">Draf laporan dan poster kumpulan; data uji rintis SIM MARISMART yang dibekalkan oleh kumpulan.</w:t>
+            </w:r>
+          </w:p>
+        </w:tc>
+        <w:tc>
+          <w:tcPr>
+            <w:tcW w:w="2088" w:type="dxa"/>
+            <w:tcMar>
+              <w:top w:w="70" w:type="dxa"/>
+              <w:left w:w="90" w:type="dxa"/>
+              <w:bottom w:w="70" w:type="dxa"/>
+              <w:right w:w="90" w:type="dxa"/>
+            </w:tcMar>
+            <w:vAlign w:val="center"/>
+          </w:tcPr>
+          <w:p>
+            <w:pPr>
+              <w:spacing w:after="0"/>
+              <w:rPr>
+                <w:lang w:val="sv-SE"/>
+              </w:rPr>
+            </w:pPr>
+            <w:r>
+              <w:t xml:space="preserve">Setiap perubahan disemak oleh ketua kumpulan; data dan angka impak dibekalkan dan disahkan oleh kumpulan, bukan dijana AI.</w:t>
+            </w:r>
+          </w:p>
+        </w:tc>
+        <w:tc>
+          <w:tcPr>
+            <w:tcW w:w="1008" w:type="dxa"/>
+            <w:tcMar>
+              <w:top w:w="70" w:type="dxa"/>
+              <w:left w:w="90" w:type="dxa"/>
+              <w:bottom w:w="70" w:type="dxa"/>
+              <w:right w:w="90" w:type="dxa"/>
+            </w:tcMar>
+            <w:vAlign w:val="center"/>
+          </w:tcPr>
+          <w:p>
+            <w:pPr>
+              <w:spacing w:after="0"/>
+            </w:pPr>
+            <w:r>
+              <w:rPr>
+                <w:strike/>
+                <w:color w:val="000000"/>
+                <w:sz w:val="17"/>
+              </w:rPr>
+              <w:t xml:space="preserve">Lulus</w:t>
             </w:r>
           </w:p>
         </w:tc>

</xml_diff>